<commit_message>
Added Risk Contributors for per project/segment and for all loaded projects. Updated treatment user docs.
</commit_message>
<xml_diff>
--- a/USER_GUIDE (Updated).docx
+++ b/USER_GUIDE (Updated).docx
@@ -1275,8 +1275,11 @@
       </w:r>
     </w:p>
     <w:p>
-      <w:r>
-        <w:t>The Treatment workflow lets you test how standard interventions affect risk before you commit changes.</w:t>
+      <w:pPr>
+        <w:pStyle w:val="Normal"/>
+      </w:pPr>
+      <w:r>
+        <w:t>The Treatment Application page lets you test safety improvements on one or more cycling path projects before committing to any changes. You can simulate what would happen if you applied standard CycleRAP interventions, preview the impact on risk scores, and compare before-and-after results across the entire project.</w:t>
       </w:r>
     </w:p>
     <w:p>
@@ -1284,12 +1287,63 @@
         <w:pStyle w:val="Heading3"/>
       </w:pPr>
       <w:r>
-        <w:t>Start from the project picker</w:t>
-      </w:r>
-    </w:p>
-    <w:p>
-      <w:r>
-        <w:t>Use the Treatment page to search for projects by project name or road name, then load one or more projects into the treatment workspace.</w:t>
+        <w:t>Step 1: Find and load your projects</w:t>
+      </w:r>
+    </w:p>
+    <w:p>
+      <w:pPr>
+        <w:pStyle w:val="Normal"/>
+      </w:pPr>
+      <w:r>
+        <w:t>When you first open Treatment Application, you will see a project picker — the same list you use on the Home page. Use it to choose which projects to work on:</w:t>
+      </w:r>
+    </w:p>
+    <w:p>
+      <w:pPr>
+        <w:pStyle w:val="ListBullet"/>
+      </w:pPr>
+      <w:r>
+        <w:t>Type a project name or road name in the Search box to filter the list.</w:t>
+      </w:r>
+    </w:p>
+    <w:p>
+      <w:pPr>
+        <w:pStyle w:val="ListBullet"/>
+      </w:pPr>
+      <w:r>
+        <w:t>Use the Filter by tag dropdown to narrow down by tag (e.g. Pre, Post, or a custom location tag).</w:t>
+      </w:r>
+    </w:p>
+    <w:p>
+      <w:pPr>
+        <w:pStyle w:val="ListBullet"/>
+      </w:pPr>
+      <w:r>
+        <w:t>The Verification Status column shows a green tick (✅) for fully verified projects and an hourglass (⏳) for projects still in progress.</w:t>
+      </w:r>
+    </w:p>
+    <w:p>
+      <w:pPr>
+        <w:pStyle w:val="ListBullet"/>
+      </w:pPr>
+      <w:r>
+        <w:t>Click a row (or tick its checkbox) to select it. You can select multiple projects at once, or use the Select All row to select every project currently visible.</w:t>
+      </w:r>
+    </w:p>
+    <w:p>
+      <w:pPr>
+        <w:pStyle w:val="ListBullet"/>
+      </w:pPr>
+      <w:r>
+        <w:t>Click the pencil icon in the Actions column to rename a project or change its tags before loading.</w:t>
+      </w:r>
+    </w:p>
+    <w:p>
+      <w:pPr>
+        <w:pStyle w:val="ListBullet"/>
+      </w:pPr>
+      <w:r>
+        <w:t>Once you have selected the projects you want, click Load Project to open the treatment workspace.</w:t>
       </w:r>
     </w:p>
     <w:p>
@@ -1297,123 +1351,189 @@
         <w:pStyle w:val="Heading3"/>
       </w:pPr>
       <w:r>
-        <w:t>Work by segment or by treatment</w:t>
-      </w:r>
-    </w:p>
-    <w:p>
-      <w:r>
-        <w:t>Inside the detailed treatment view, you can switch between:</w:t>
+        <w:t>Step 2: Understanding the treatment workspace layout</w:t>
+      </w:r>
+    </w:p>
+    <w:p>
+      <w:pPr>
+        <w:pStyle w:val="Normal"/>
+      </w:pPr>
+      <w:r>
+        <w:t>After loading, the workspace is divided into several areas:</w:t>
       </w:r>
     </w:p>
     <w:p>
       <w:pPr>
         <w:pStyle w:val="ListBullet"/>
+      </w:pPr>
+      <w:r>
+        <w:t>Project tabs (shown at the top when you loaded more than one project) — click a tab to jump to the first segment of that project.</w:t>
+      </w:r>
+    </w:p>
+    <w:p>
+      <w:pPr>
+        <w:pStyle w:val="ListBullet"/>
+      </w:pPr>
+      <w:r>
+        <w:t>Before Treatment and After Treatment maps — a side-by-side pair of maps at the top of the page, showing every segment colour-coded by risk level. The left map always shows the original scores; the right map updates as you apply treatments.</w:t>
+      </w:r>
+    </w:p>
+    <w:p>
+      <w:pPr>
+        <w:pStyle w:val="ListBullet"/>
+      </w:pPr>
+      <w:r>
+        <w:t>A three-column panel below the maps — Treatment Options on the left, the segment image in the middle, and the scores and attributes on the right.</w:t>
+      </w:r>
+    </w:p>
+    <w:p>
+      <w:pPr>
+        <w:pStyle w:val="ListBullet"/>
+      </w:pPr>
+      <w:r>
+        <w:t>An Overall Treatment Analysis section at the bottom with pie charts comparing the project-wide risk distribution before and after all treatments you have applied.</w:t>
+      </w:r>
+    </w:p>
+    <w:p>
+      <w:pPr>
+        <w:pStyle w:val="Normal"/>
+      </w:pPr>
+      <w:r>
+        <w:t>The page number shown at the top right (e.g. 3 / 120) tells you which segment you are currently viewing out of the total across all loaded projects. Use the Previous and Next buttons, or type a segment number directly into the input box, to navigate.</w:t>
+      </w:r>
+    </w:p>
+    <w:p>
+      <w:pPr>
+        <w:pStyle w:val="Heading3"/>
+      </w:pPr>
+      <w:r>
+        <w:t>Step 3: Choose how to view treatments — By Segment or By Treatment</w:t>
+      </w:r>
+    </w:p>
+    <w:p>
+      <w:pPr>
+        <w:pStyle w:val="Normal"/>
+      </w:pPr>
+      <w:r>
+        <w:t>The Treatment Options panel on the left has a dropdown that lets you switch between two views:</w:t>
+      </w:r>
+    </w:p>
+    <w:p>
+      <w:pPr>
+        <w:pStyle w:val="ListBullet"/>
+      </w:pPr>
+      <w:r>
         <w:rPr>
-          <w:ins w:id="72" w:author="Puay Ping KOH (LTA)" w:date="2026-05-11T16:02:00Z" w16du:dateUtc="2026-05-11T08:02:00Z"/>
+          <w:b/>
         </w:rPr>
-      </w:pPr>
-      <w:r>
-        <w:t>By Segment to review the current segment and its applicable treatments</w:t>
+        <w:t>By Segment</w:t>
+      </w:r>
+      <w:r>
+        <w:t xml:space="preserve"> — shows only the treatments that are relevant to the segment you are currently viewing. Each treatment is ranked by how much it would reduce the risk score for that specific segment (shown as "Score drop: X.X"). Use this view when you want to focus on improving one segment at a time.</w:t>
       </w:r>
     </w:p>
     <w:p>
       <w:pPr>
         <w:pStyle w:val="ListBullet"/>
-        <w:tabs>
-          <w:tab w:val="clear" w:pos="360"/>
-          <w:tab w:val="num" w:pos="720"/>
-        </w:tabs>
-        <w:ind w:left="720"/>
-        <w:pPrChange w:id="73" w:author="Puay Ping KOH (LTA)" w:date="2026-05-11T16:02:00Z" w16du:dateUtc="2026-05-11T08:02:00Z">
-          <w:pPr>
-            <w:pStyle w:val="ListBullet"/>
-          </w:pPr>
-        </w:pPrChange>
-      </w:pPr>
-      <w:ins w:id="74" w:author="Puay Ping KOH (LTA)" w:date="2026-05-11T16:02:00Z" w16du:dateUtc="2026-05-11T08:02:00Z">
-        <w:r>
-          <w:t xml:space="preserve">The treatments are sorted in descending order of </w:t>
-        </w:r>
-      </w:ins>
-      <w:ins w:id="75" w:author="Puay Ping KOH (LTA)" w:date="2026-05-11T16:03:00Z" w16du:dateUtc="2026-05-11T08:03:00Z">
-        <w:r>
-          <w:t>how much risk score changes</w:t>
-        </w:r>
-      </w:ins>
+      </w:pPr>
+      <w:r>
+        <w:rPr>
+          <w:b/>
+        </w:rPr>
+        <w:t>By Treatment</w:t>
+      </w:r>
+      <w:r>
+        <w:t xml:space="preserve"> — shows all treatments that are applicable to at least one segment across the entire loaded project. Each treatment shows the percentage of segments it would improve (e.g. "Improves 12.5% of segments"). Treatments are ranked from most to least effective. Use this view when you want to apply a single intervention type across many segments at once.</w:t>
+      </w:r>
+    </w:p>
+    <w:p>
+      <w:pPr>
+        <w:pStyle w:val="Heading3"/>
+      </w:pPr>
+      <w:r>
+        <w:t>Step 4: Select and preview treatments</w:t>
+      </w:r>
+    </w:p>
+    <w:p>
+      <w:pPr>
+        <w:pStyle w:val="Normal"/>
+      </w:pPr>
+      <w:r>
+        <w:t>Tick the checkbox next to one or more treatments to select them. Selected treatments are highlighted in blue. You can also use the All button at the bottom of the panel to select every applicable treatment at once, or the Clear button to deselect all.</w:t>
+      </w:r>
+    </w:p>
+    <w:p>
+      <w:pPr>
+        <w:pStyle w:val="Normal"/>
+      </w:pPr>
+      <w:r>
+        <w:t>As soon as you tick a treatment, the Scores card on the right will show a live preview of what the risk scores would look like if you applied those treatments — without actually saving anything yet. The preview appears with a light background to indicate it is not yet confirmed. You can select multiple treatments to see their combined effect.</w:t>
+      </w:r>
+    </w:p>
+    <w:p>
+      <w:pPr>
+        <w:pStyle w:val="Normal"/>
+      </w:pPr>
+      <w:r>
+        <w:t>The attributes panel also has a Show Post-Treatment toggle. Switch this on to see exactly which attribute values would change and how, highlighted in the table.</w:t>
+      </w:r>
+    </w:p>
+    <w:p>
+      <w:pPr>
+        <w:pStyle w:val="Heading3"/>
+      </w:pPr>
+      <w:r>
+        <w:t>Step 5: Apply treatments</w:t>
+      </w:r>
+    </w:p>
+    <w:p>
+      <w:pPr>
+        <w:pStyle w:val="Normal"/>
+      </w:pPr>
+      <w:r>
+        <w:t>When you are satisfied with your selection, click Apply (N) at the bottom of the Treatment Options panel — where N is the number of treatments you have selected.</w:t>
+      </w:r>
     </w:p>
     <w:p>
       <w:pPr>
         <w:pStyle w:val="ListBullet"/>
+      </w:pPr>
+      <w:r>
+        <w:t xml:space="preserve">In </w:t>
+      </w:r>
+      <w:r>
         <w:rPr>
-          <w:ins w:id="76" w:author="Puay Ping KOH (LTA)" w:date="2026-05-11T16:01:00Z" w16du:dateUtc="2026-05-11T08:01:00Z"/>
+          <w:b/>
         </w:rPr>
-      </w:pPr>
-      <w:r>
-        <w:t xml:space="preserve">By Treatment to </w:t>
-      </w:r>
-      <w:del w:id="77" w:author="Puay Ping KOH (LTA)" w:date="2026-05-11T16:01:00Z" w16du:dateUtc="2026-05-11T08:01:00Z">
-        <w:r>
-          <w:delText xml:space="preserve">rank </w:delText>
-        </w:r>
-      </w:del>
-      <w:ins w:id="78" w:author="Puay Ping KOH (LTA)" w:date="2026-05-11T16:01:00Z" w16du:dateUtc="2026-05-11T08:01:00Z">
-        <w:r>
-          <w:t xml:space="preserve">stack </w:t>
-        </w:r>
-      </w:ins>
-      <w:r>
-        <w:t xml:space="preserve">treatments </w:t>
+        <w:t>By Segment</w:t>
+      </w:r>
+      <w:r>
+        <w:t xml:space="preserve"> mode, Apply saves the selected treatments for the current segment only. The treatment card turns green with a tick (✓) to confirm it has been recorded, and the After Treatment map updates to reflect the change.</w:t>
       </w:r>
     </w:p>
     <w:p>
       <w:pPr>
         <w:pStyle w:val="ListBullet"/>
-        <w:numPr>
-          <w:ilvl w:val="0"/>
-          <w:numId w:val="0"/>
-        </w:numPr>
-        <w:ind w:left="360"/>
-        <w:pPrChange w:id="79" w:author="Puay Ping KOH (LTA)" w:date="2026-05-11T16:02:00Z" w16du:dateUtc="2026-05-11T08:02:00Z">
-          <w:pPr>
-            <w:pStyle w:val="ListBullet"/>
-          </w:pPr>
-        </w:pPrChange>
-      </w:pPr>
-      <w:ins w:id="80" w:author="Puay Ping KOH (LTA)" w:date="2026-05-11T16:02:00Z" w16du:dateUtc="2026-05-11T08:02:00Z">
-        <w:r>
-          <w:t xml:space="preserve">The treatments are sorted in descending order </w:t>
-        </w:r>
-      </w:ins>
-      <w:r>
-        <w:t xml:space="preserve">by how </w:t>
-      </w:r>
-      <w:del w:id="81" w:author="Puay Ping KOH (LTA)" w:date="2026-05-11T16:03:00Z" w16du:dateUtc="2026-05-11T08:03:00Z">
-        <w:r>
-          <w:delText xml:space="preserve">often </w:delText>
-        </w:r>
-      </w:del>
-      <w:ins w:id="82" w:author="Puay Ping KOH (LTA)" w:date="2026-05-11T16:03:00Z" w16du:dateUtc="2026-05-11T08:03:00Z">
-        <w:r>
-          <w:t>many</w:t>
-        </w:r>
-      </w:ins>
-      <w:del w:id="83" w:author="Puay Ping KOH (LTA)" w:date="2026-05-11T16:03:00Z" w16du:dateUtc="2026-05-11T08:03:00Z">
-        <w:r>
-          <w:delText xml:space="preserve">they </w:delText>
-        </w:r>
-      </w:del>
-      <w:ins w:id="84" w:author="Puay Ping KOH (LTA)" w:date="2026-05-11T16:03:00Z" w16du:dateUtc="2026-05-11T08:03:00Z">
-        <w:r>
-          <w:t>risk bands are improved</w:t>
-        </w:r>
-      </w:ins>
-      <w:del w:id="85" w:author="Puay Ping KOH (LTA)" w:date="2026-05-11T16:03:00Z" w16du:dateUtc="2026-05-11T08:03:00Z">
-        <w:r>
-          <w:delText xml:space="preserve">improve segments </w:delText>
-        </w:r>
-      </w:del>
-      <w:r>
-        <w:t>across the loaded data</w:t>
+      </w:pPr>
+      <w:r>
+        <w:t xml:space="preserve">In </w:t>
+      </w:r>
+      <w:r>
+        <w:rPr>
+          <w:b/>
+        </w:rPr>
+        <w:t>By Treatment</w:t>
+      </w:r>
+      <w:r>
+        <w:t xml:space="preserve"> mode, Apply triggers a confirmation dialog listing each selected treatment and asking whether you want to apply it to all eligible segments across the project. Click Confirm to proceed. This is useful for applying a single policy improvement (such as "Install street lighting") everywhere it is needed in one action.</w:t>
+      </w:r>
+    </w:p>
+    <w:p>
+      <w:pPr>
+        <w:pStyle w:val="Normal"/>
+      </w:pPr>
+      <w:r>
+        <w:t>If you change your mind about an applied treatment on the current segment, click the Reset button that appears after a treatment has been applied. This removes all treatments from that segment and restores the original scores.</w:t>
       </w:r>
     </w:p>
     <w:p>
@@ -1421,12 +1541,23 @@
         <w:pStyle w:val="Heading3"/>
       </w:pPr>
       <w:r>
-        <w:t>Preview and apply</w:t>
-      </w:r>
-    </w:p>
-    <w:p>
-      <w:r>
-        <w:t>You can:</w:t>
+        <w:t>Step 6: Read the segment image, scores, and attributes</w:t>
+      </w:r>
+    </w:p>
+    <w:p>
+      <w:pPr>
+        <w:pStyle w:val="Normal"/>
+      </w:pPr>
+      <w:r>
+        <w:t>The middle column shows the street-level photograph for the current segment. Use Previous and Next to move between segments while staying on the same page. If no image is available for a segment, the panel will be empty.</w:t>
+      </w:r>
+    </w:p>
+    <w:p>
+      <w:pPr>
+        <w:pStyle w:val="Normal"/>
+      </w:pPr>
+      <w:r>
+        <w:t>The right column shows two panels:</w:t>
       </w:r>
     </w:p>
     <w:p>
@@ -1434,15 +1565,13 @@
         <w:pStyle w:val="ListBullet"/>
       </w:pPr>
       <w:r>
-        <w:t xml:space="preserve">preview the effect of treatments </w:t>
-      </w:r>
-      <w:ins w:id="86" w:author="Puay Ping KOH (LTA)" w:date="2026-05-11T15:59:00Z" w16du:dateUtc="2026-05-11T07:59:00Z">
-        <w:r>
-          <w:t xml:space="preserve">(i.e. change in risk score/band) </w:t>
-        </w:r>
-      </w:ins>
-      <w:r>
-        <w:t>before saving</w:t>
+        <w:rPr>
+          <w:b/>
+        </w:rPr>
+        <w:t>Segment Scores</w:t>
+      </w:r>
+      <w:r>
+        <w:t xml:space="preserve"> — displays the four CycleRAP risk scores for the current segment: Vehicle-Bicycle (VB), Bicycle-Bicycle (BB), Single-Bicycle (SB), and Bicycle-Pedestrian (BP). Each score is shown alongside its risk band (Low, Medium, High, or Extreme) and the attributes that contributed most to it. When a treatment preview is active, the scores update to reflect the expected change.</w:t>
       </w:r>
     </w:p>
     <w:p>
@@ -1450,23 +1579,29 @@
         <w:pStyle w:val="ListBullet"/>
       </w:pPr>
       <w:r>
-        <w:t>apply selected treatment</w:t>
-      </w:r>
-      <w:ins w:id="87" w:author="Puay Ping KOH (LTA)" w:date="2026-05-11T15:59:00Z" w16du:dateUtc="2026-05-11T07:59:00Z">
-        <w:r>
-          <w:t>(</w:t>
-        </w:r>
-      </w:ins>
-      <w:r>
-        <w:t>s</w:t>
-      </w:r>
-      <w:ins w:id="88" w:author="Puay Ping KOH (LTA)" w:date="2026-05-11T15:59:00Z" w16du:dateUtc="2026-05-11T07:59:00Z">
-        <w:r>
-          <w:t>)</w:t>
-        </w:r>
-      </w:ins>
-      <w:r>
-        <w:t xml:space="preserve"> to one segment</w:t>
+        <w:rPr>
+          <w:b/>
+        </w:rPr>
+        <w:t>Attributes panel</w:t>
+      </w:r>
+      <w:r>
+        <w:t xml:space="preserve"> — lists all coded attribute values for the current segment. Toggle Show Post-Treatment on to highlight which fields would be changed by the selected or applied treatments (they are marked in colour with the label "Modified by treatment"). Toggle it off to see the original coded values.</w:t>
+      </w:r>
+    </w:p>
+    <w:p>
+      <w:pPr>
+        <w:pStyle w:val="Heading3"/>
+      </w:pPr>
+      <w:r>
+        <w:t>Step 7: Before and After maps</w:t>
+      </w:r>
+    </w:p>
+    <w:p>
+      <w:pPr>
+        <w:pStyle w:val="Normal"/>
+      </w:pPr>
+      <w:r>
+        <w:t>The two maps at the top of the page give you a project-wide view of how treatments are changing risk levels across all segments:</w:t>
       </w:r>
     </w:p>
     <w:p>
@@ -1474,7 +1609,13 @@
         <w:pStyle w:val="ListBullet"/>
       </w:pPr>
       <w:r>
-        <w:t>apply one treatment across all applicable segments</w:t>
+        <w:rPr>
+          <w:b/>
+        </w:rPr>
+        <w:t>Before Treatment map</w:t>
+      </w:r>
+      <w:r>
+        <w:t xml:space="preserve"> — always shows the original risk-band colouring for every segment (green = Low, yellow = Medium, orange = High, purple = Extreme).</w:t>
       </w:r>
     </w:p>
     <w:p>
@@ -1482,7 +1623,13 @@
         <w:pStyle w:val="ListBullet"/>
       </w:pPr>
       <w:r>
-        <w:t>apply all applicable treatments in bulk</w:t>
+        <w:rPr>
+          <w:b/>
+        </w:rPr>
+        <w:t>After Treatment map</w:t>
+      </w:r>
+      <w:r>
+        <w:t xml:space="preserve"> — updates in real time as you apply treatments. Segments that have been treated and whose risk band has improved will appear in a lighter colour. Click any segment on either map to navigate to it.</w:t>
       </w:r>
     </w:p>
     <w:p>
@@ -1490,12 +1637,15 @@
         <w:pStyle w:val="Heading3"/>
       </w:pPr>
       <w:r>
-        <w:t>Save or reset</w:t>
-      </w:r>
-    </w:p>
-    <w:p>
-      <w:r>
-        <w:t>Treatment changes can be reviewed before they are finalized. Use the page controls to:</w:t>
+        <w:t>Step 8: Generate AI visualisations of proposed improvements</w:t>
+      </w:r>
+    </w:p>
+    <w:p>
+      <w:pPr>
+        <w:pStyle w:val="Normal"/>
+      </w:pPr>
+      <w:r>
+        <w:t>The Treatment Options panel includes two clipboard buttons that help you create visual representations of proposed improvements using an AI image tool (such as ChatGPT image generation):</w:t>
       </w:r>
     </w:p>
     <w:p>
@@ -1503,7 +1653,13 @@
         <w:pStyle w:val="ListBullet"/>
       </w:pPr>
       <w:r>
-        <w:t>save the treatment state</w:t>
+        <w:rPr>
+          <w:b/>
+        </w:rPr>
+        <w:t>Copy prompt</w:t>
+      </w:r>
+      <w:r>
+        <w:t xml:space="preserve"> — copies a ready-to-use text prompt describing the selected treatments in plain language, tailored to the Singapore cycling infrastructure context. Paste this prompt into your AI image tool alongside the segment photograph to generate a before-and-after visualisation.</w:t>
       </w:r>
     </w:p>
     <w:p>
@@ -1511,7 +1667,37 @@
         <w:pStyle w:val="ListBullet"/>
       </w:pPr>
       <w:r>
-        <w:t>reset pending treatment changes</w:t>
+        <w:rPr>
+          <w:b/>
+        </w:rPr>
+        <w:t>Copy image</w:t>
+      </w:r>
+      <w:r>
+        <w:t xml:space="preserve"> — copies the current segment photograph directly to your clipboard. Paste it into the same AI tool together with the prompt. Both buttons work together: copy the image first, then paste it into the AI tool, then paste the prompt text.</w:t>
+      </w:r>
+    </w:p>
+    <w:p>
+      <w:pPr>
+        <w:pStyle w:val="Normal"/>
+      </w:pPr>
+      <w:r>
+        <w:t>The prompt is automatically adapted to whichever treatments you have selected or applied for the current segment, so you always get a description that matches what you are proposing.</w:t>
+      </w:r>
+    </w:p>
+    <w:p>
+      <w:pPr>
+        <w:pStyle w:val="Heading3"/>
+      </w:pPr>
+      <w:r>
+        <w:t>Step 9: Review the Overall Treatment Analysis</w:t>
+      </w:r>
+    </w:p>
+    <w:p>
+      <w:pPr>
+        <w:pStyle w:val="Normal"/>
+      </w:pPr>
+      <w:r>
+        <w:t>Scroll to the bottom of the page to see the Overall Treatment Analysis section. It shows two rows of five pie charts — one for each crash type (Overall Risk Level, Bicycle-Bicycle, Single-Bicycle, Bicycle-Pedestrian, and Vehicle-Bicycle):</w:t>
       </w:r>
     </w:p>
     <w:p>
@@ -1519,12 +1705,99 @@
         <w:pStyle w:val="ListBullet"/>
       </w:pPr>
       <w:r>
-        <w:t>compare before and after scores while deciding what to keep</w:t>
-      </w:r>
-    </w:p>
-    <w:p>
-      <w:r>
-        <w:br w:type="page"/>
+        <w:rPr>
+          <w:b/>
+        </w:rPr>
+        <w:t>Before Treatment row</w:t>
+      </w:r>
+      <w:r>
+        <w:t xml:space="preserve"> — shows how the full project is currently distributed across the four risk bands.</w:t>
+      </w:r>
+    </w:p>
+    <w:p>
+      <w:pPr>
+        <w:pStyle w:val="ListBullet"/>
+      </w:pPr>
+      <w:r>
+        <w:rPr>
+          <w:b/>
+        </w:rPr>
+        <w:t>After Treatment row</w:t>
+      </w:r>
+      <w:r>
+        <w:t xml:space="preserve"> — shows the updated distribution once all treatments you have applied are taken into account. If you have only treated a subset of segments, the remaining untreated segments retain their original scores.</w:t>
+      </w:r>
+    </w:p>
+    <w:p>
+      <w:pPr>
+        <w:pStyle w:val="Normal"/>
+      </w:pPr>
+      <w:r>
+        <w:t>Use these charts to get a quick sense of whether the treatments you have applied make a meaningful dent in the overall risk profile of the project.</w:t>
+      </w:r>
+    </w:p>
+    <w:p>
+      <w:pPr>
+        <w:pStyle w:val="Heading3"/>
+      </w:pPr>
+      <w:r>
+        <w:t>Tips and common workflows</w:t>
+      </w:r>
+    </w:p>
+    <w:p>
+      <w:pPr>
+        <w:pStyle w:val="ListBullet"/>
+      </w:pPr>
+      <w:r>
+        <w:rPr>
+          <w:b/>
+        </w:rPr>
+        <w:t>Pre and Post tagging</w:t>
+      </w:r>
+      <w:r>
+        <w:t xml:space="preserve"> — if you are working with a before-and-after survey pair, tag one project "Pre" and the other "Post" on the Home page. Load both into Treatment Application together to compare their score distributions side by side using the project tabs.</w:t>
+      </w:r>
+    </w:p>
+    <w:p>
+      <w:pPr>
+        <w:pStyle w:val="ListBullet"/>
+      </w:pPr>
+      <w:r>
+        <w:rPr>
+          <w:b/>
+        </w:rPr>
+        <w:t>Applying a single improvement across a whole project</w:t>
+      </w:r>
+      <w:r>
+        <w:t xml:space="preserve"> — switch to By Treatment view, find the treatment you want (e.g. "Install street lighting"), tick it, and click Apply. Confirm in the dialog. The After Treatment map will update immediately to show the effect across all eligible segments.</w:t>
+      </w:r>
+    </w:p>
+    <w:p>
+      <w:pPr>
+        <w:pStyle w:val="ListBullet"/>
+      </w:pPr>
+      <w:r>
+        <w:rPr>
+          <w:b/>
+        </w:rPr>
+        <w:t>Undoing all changes</w:t>
+      </w:r>
+      <w:r>
+        <w:t xml:space="preserve"> — if you want to start fresh, navigate to each segment that has been treated and click Reset. The Overall Treatment Analysis will update accordingly.</w:t>
+      </w:r>
+    </w:p>
+    <w:p>
+      <w:pPr>
+        <w:pStyle w:val="ListBullet"/>
+      </w:pPr>
+      <w:r>
+        <w:rPr>
+          <w:b/>
+        </w:rPr>
+        <w:t>Checking what was applied</w:t>
+      </w:r>
+      <w:r>
+        <w:t xml:space="preserve"> — treatments that have already been saved are shown with a green background and a tick (✓) in the list. If a treatment appears greyed out and untickable, it means it has already been applied to the current segment.</w:t>
       </w:r>
     </w:p>
     <w:p>

</xml_diff>